<commit_message>
almost done organizing grading
</commit_message>
<xml_diff>
--- a/media_essays.docx
+++ b/media_essays.docx
@@ -37,7 +37,15 @@
     </w:p>
     <w:p>
       <w:r>
-        <w:t xml:space="preserve">Excellent purpose structure, lower substantive. 10 style. </w:t>
+        <w:t xml:space="preserve">Excellent purpose structure, lower substantive. 10 </w:t>
+      </w:r>
+      <w:proofErr w:type="gramStart"/>
+      <w:r>
+        <w:t>style</w:t>
+      </w:r>
+      <w:proofErr w:type="gramEnd"/>
+      <w:r>
+        <w:t xml:space="preserve">. </w:t>
       </w:r>
     </w:p>
     <w:p/>
@@ -65,7 +73,23 @@
     </w:p>
     <w:p>
       <w:r>
-        <w:t>Joel – this is great. It’s clear and well structured, and defends an original – but still informed (including by course material) and credible –  perspective.</w:t>
+        <w:t xml:space="preserve">Joel – this is great. It’s clear and well </w:t>
+      </w:r>
+      <w:proofErr w:type="gramStart"/>
+      <w:r>
+        <w:t>structured, and</w:t>
+      </w:r>
+      <w:proofErr w:type="gramEnd"/>
+      <w:r>
+        <w:t xml:space="preserve"> defends an original – but still informed (including by course material) and credible </w:t>
+      </w:r>
+      <w:proofErr w:type="gramStart"/>
+      <w:r>
+        <w:t>–  perspective</w:t>
+      </w:r>
+      <w:proofErr w:type="gramEnd"/>
+      <w:r>
+        <w:t>.</w:t>
       </w:r>
       <w:r>
         <w:t xml:space="preserve"> Specifically, re: the point that the real problem vis-à-vis rational ignorance and media that we need to be concerned about is rational ignorance keeping people on the couch – this is </w:t>
@@ -76,10 +100,18 @@
         <w:t>P&amp;S –</w:t>
       </w:r>
       <w:r>
-        <w:t xml:space="preserve"> Excellent -- </w:t>
-      </w:r>
-      <w:r>
-        <w:t xml:space="preserve"> Overall, very clear and well-structured. The essay anticipates and addresses likely objections, builds in a coherent structure, and avoids irrelevant arguments and summaries. </w:t>
+        <w:t xml:space="preserve"> Excellent </w:t>
+      </w:r>
+      <w:proofErr w:type="gramStart"/>
+      <w:r>
+        <w:t xml:space="preserve">-- </w:t>
+      </w:r>
+      <w:r>
+        <w:t xml:space="preserve"> Overall</w:t>
+      </w:r>
+      <w:proofErr w:type="gramEnd"/>
+      <w:r>
+        <w:t xml:space="preserve">, very clear and well-structured. The essay anticipates and addresses likely objections, builds in a coherent structure, and avoids irrelevant arguments and summaries. </w:t>
       </w:r>
     </w:p>
     <w:p>
@@ -112,14 +144,30 @@
           <w:b/>
           <w:bCs/>
         </w:rPr>
-        <w:t xml:space="preserve">Ryne Kapen </w:t>
-      </w:r>
+        <w:t xml:space="preserve">Ryne </w:t>
+      </w:r>
+      <w:proofErr w:type="gramStart"/>
       <w:r>
         <w:rPr>
           <w:b/>
           <w:bCs/>
         </w:rPr>
-        <w:t xml:space="preserve"> - B+/A-</w:t>
+        <w:t xml:space="preserve">Kapen </w:t>
+      </w:r>
+      <w:r>
+        <w:rPr>
+          <w:b/>
+          <w:bCs/>
+        </w:rPr>
+        <w:t xml:space="preserve"> -</w:t>
+      </w:r>
+      <w:proofErr w:type="gramEnd"/>
+      <w:r>
+        <w:rPr>
+          <w:b/>
+          <w:bCs/>
+        </w:rPr>
+        <w:t xml:space="preserve"> B+/A-</w:t>
       </w:r>
     </w:p>
     <w:p>
@@ -143,12 +191,33 @@
     </w:p>
     <w:p>
       <w:r>
-        <w:t xml:space="preserve">The core argument introduced: media reduces RI by (1) collecting, ….etc information, and (2) when done correctly serve as an intermediary is mostly clear and well-supported. </w:t>
-      </w:r>
-    </w:p>
-    <w:p>
-      <w:r>
-        <w:t xml:space="preserve">The argument about media shaping political identity could be strengthened. It’s not clear from this paragraph whether we should expect the  reduced cognitive load and the causal chain described decrease rational ignorance in a meaningful way versus providing something akin to a series of shortcuts, if that makes sense. </w:t>
+        <w:t xml:space="preserve">The core argument introduced: media reduces RI by (1) collecting, </w:t>
+      </w:r>
+      <w:proofErr w:type="gramStart"/>
+      <w:r>
+        <w:t>….</w:t>
+      </w:r>
+      <w:proofErr w:type="spellStart"/>
+      <w:r>
+        <w:t>etc</w:t>
+      </w:r>
+      <w:proofErr w:type="spellEnd"/>
+      <w:proofErr w:type="gramEnd"/>
+      <w:r>
+        <w:t xml:space="preserve"> information, and (2) when done correctly serve as an intermediary is mostly clear and well-supported. </w:t>
+      </w:r>
+    </w:p>
+    <w:p>
+      <w:r>
+        <w:t xml:space="preserve">The argument about media shaping political identity could be strengthened. It’s not clear from this paragraph whether we should expect </w:t>
+      </w:r>
+      <w:proofErr w:type="gramStart"/>
+      <w:r>
+        <w:t>the  reduced</w:t>
+      </w:r>
+      <w:proofErr w:type="gramEnd"/>
+      <w:r>
+        <w:t xml:space="preserve"> cognitive load and the causal chain described decrease rational ignorance in a meaningful way versus providing something akin to a series of shortcuts, if that makes sense. </w:t>
       </w:r>
     </w:p>
     <w:p>
@@ -217,7 +286,15 @@
     </w:p>
     <w:p>
       <w:r>
-        <w:t xml:space="preserve">The line of argument around media targeting is a little bit incongruent with the essay’s development. The point that so long as neighborhoods, advocates of contested issues, swing voters exert enough pressure to hold politicians accountable is really interesting and relevant to course material from the semester, but it could be its own paper/thesis and is not entirely developed in the paragraph. </w:t>
+        <w:t xml:space="preserve">The line of argument around media targeting is a little bit incongruent with the essay’s development. The point that so long as neighborhoods, advocates of contested issues, swing voters exert enough pressure to hold politicians accountable is </w:t>
+      </w:r>
+      <w:proofErr w:type="gramStart"/>
+      <w:r>
+        <w:t>really interesting</w:t>
+      </w:r>
+      <w:proofErr w:type="gramEnd"/>
+      <w:r>
+        <w:t xml:space="preserve"> and relevant to course material from the semester, but it could be its own paper/thesis and is not entirely developed in the paragraph. </w:t>
       </w:r>
     </w:p>
     <w:p/>
@@ -231,7 +308,15 @@
         <w:t xml:space="preserve">The essay is well-researched, but it’s reliance on outside of course sources might lead it to under-engage with some course material that would complicate or deepen arguments. </w:t>
       </w:r>
       <w:r>
-        <w:t xml:space="preserve">This includes most broadly matters of the demand-side of media; specifically conflating journalism with clickbait. It also appears a bit in the concluding remarks about the onus falling on citizens to realize their normative obligations to be informed. </w:t>
+        <w:t xml:space="preserve">This includes most broadly matters of the demand-side of </w:t>
+      </w:r>
+      <w:proofErr w:type="gramStart"/>
+      <w:r>
+        <w:t>media;</w:t>
+      </w:r>
+      <w:proofErr w:type="gramEnd"/>
+      <w:r>
+        <w:t xml:space="preserve"> specifically conflating journalism with clickbait. It also appears a bit in the concluding remarks about the onus falling on citizens to realize their normative obligations to be informed. </w:t>
       </w:r>
     </w:p>
     <w:p/>
@@ -258,14 +343,30 @@
           <w:b/>
           <w:bCs/>
         </w:rPr>
-        <w:t>Gabrielle Nicoleau</w:t>
-      </w:r>
+        <w:t xml:space="preserve">Gabrielle </w:t>
+      </w:r>
+      <w:proofErr w:type="gramStart"/>
       <w:r>
         <w:rPr>
           <w:b/>
           <w:bCs/>
         </w:rPr>
-        <w:t xml:space="preserve">  -- B</w:t>
+        <w:t>Nicoleau</w:t>
+      </w:r>
+      <w:r>
+        <w:rPr>
+          <w:b/>
+          <w:bCs/>
+        </w:rPr>
+        <w:t xml:space="preserve">  --</w:t>
+      </w:r>
+      <w:proofErr w:type="gramEnd"/>
+      <w:r>
+        <w:rPr>
+          <w:b/>
+          <w:bCs/>
+        </w:rPr>
+        <w:t xml:space="preserve"> B</w:t>
       </w:r>
     </w:p>
     <w:p>
@@ -275,7 +376,15 @@
     </w:p>
     <w:p>
       <w:r>
-        <w:t xml:space="preserve">The matter of political moderates should be signaled at in the thesis statement or intro. Without, the essay develops the moderates argument that, though it develops logically, </w:t>
+        <w:t xml:space="preserve">The matter of political moderates should be signaled at in the thesis statement or intro. Without, the essay develops the </w:t>
+      </w:r>
+      <w:proofErr w:type="gramStart"/>
+      <w:r>
+        <w:t>moderates</w:t>
+      </w:r>
+      <w:proofErr w:type="gramEnd"/>
+      <w:r>
+        <w:t xml:space="preserve"> argument that, though it develops logically, </w:t>
       </w:r>
       <w:r>
         <w:lastRenderedPageBreak/>
@@ -284,7 +393,15 @@
     </w:p>
     <w:p>
       <w:r>
-        <w:t xml:space="preserve">Similarly, the argument about third party fact checking similarly reads as a bit disjointed, particularly since the moderates paragraph ends with a set of potential limitations that read as though they might be tended to in a subsequent counter-argument paragraph.  </w:t>
+        <w:t xml:space="preserve">Similarly, the argument about third party fact checking similarly reads as a bit disjointed, particularly since the </w:t>
+      </w:r>
+      <w:proofErr w:type="gramStart"/>
+      <w:r>
+        <w:t>moderates</w:t>
+      </w:r>
+      <w:proofErr w:type="gramEnd"/>
+      <w:r>
+        <w:t xml:space="preserve"> paragraph ends with a set of potential limitations that read as though they might be tended to in a subsequent counter-argument paragraph.  </w:t>
       </w:r>
     </w:p>
     <w:p>
@@ -381,8 +498,13 @@
       </w:r>
     </w:p>
     <w:p>
-      <w:r>
-        <w:t xml:space="preserve">Popkin I think complicates relationships between media and rational ignorance, in part because people think salient to them = credible (akin to Zaller RAS). </w:t>
+      <w:proofErr w:type="gramStart"/>
+      <w:r>
+        <w:t>Popkin</w:t>
+      </w:r>
+      <w:proofErr w:type="gramEnd"/>
+      <w:r>
+        <w:t xml:space="preserve"> I think complicates relationships between media and rational ignorance, in part because people think salient to them = credible (akin to Zaller RAS). </w:t>
       </w:r>
     </w:p>
     <w:p>
@@ -456,21 +578,69 @@
         <w:t xml:space="preserve">correctly cites </w:t>
       </w:r>
       <w:r>
-        <w:t>one of Hamilton’s ID’ed three motivations for engaging with political news, beyond rational investment. It interprets implications for soft news that are distinct from Hamilton’s (he follows up his acknowledgement about incidental learning by noting those “positive externalities” are underproduced, and that the demand for this kind of coverage means that substantive policy news will be overrun by information that is not meaningful for political learning</w:t>
-      </w:r>
-      <w:r>
-        <w:t>). I’m also not sure that Hamilton suggests limited information acquired via soft news will have benefits – he’s pretty cautionary about soft news but also stresses that an econ model can’t tell us “outcomes of news markets,” and (at the time) existing empirical work could not answer the “impact of news coverage on indiviaudals’ political decisions.”</w:t>
-      </w:r>
-    </w:p>
-    <w:p>
-      <w:r>
-        <w:t xml:space="preserve">The net net on purpose &amp; structure and substance these points is that the essay needs to signal when and how it is deviating from the readings it draws on – without doing so it inadvertently reflects a misunderstanding of the material. </w:t>
+        <w:t xml:space="preserve">one of Hamilton’s </w:t>
+      </w:r>
+      <w:proofErr w:type="spellStart"/>
+      <w:r>
+        <w:t>ID’ed</w:t>
+      </w:r>
+      <w:proofErr w:type="spellEnd"/>
+      <w:r>
+        <w:t xml:space="preserve"> three motivations for engaging with political news, beyond rational investment. It interprets implications for soft news that are distinct from Hamilton’s (he follows up his acknowledgement about incidental learning by noting those “positive externalities” are underproduced, and that the demand for this kind of coverage means that substantive policy news will be overrun by information that is not meaningful for political learning</w:t>
+      </w:r>
+      <w:r>
+        <w:t xml:space="preserve">). I’m also not sure that Hamilton suggests limited information acquired via soft news will have benefits – he’s </w:t>
+      </w:r>
+      <w:proofErr w:type="gramStart"/>
+      <w:r>
+        <w:t>pretty cautionary</w:t>
+      </w:r>
+      <w:proofErr w:type="gramEnd"/>
+      <w:r>
+        <w:t xml:space="preserve"> about soft news but also stresses that an econ model can’t tell </w:t>
+      </w:r>
+      <w:proofErr w:type="gramStart"/>
+      <w:r>
+        <w:t>us</w:t>
+      </w:r>
+      <w:proofErr w:type="gramEnd"/>
+      <w:r>
+        <w:t xml:space="preserve"> “outcomes of news markets,” and (at the time) existing empirical work could not answer the “impact of news coverage on </w:t>
+      </w:r>
+      <w:proofErr w:type="spellStart"/>
+      <w:r>
+        <w:t>indiviaudals</w:t>
+      </w:r>
+      <w:proofErr w:type="spellEnd"/>
+      <w:r>
+        <w:t>’ political decisions.”</w:t>
+      </w:r>
+    </w:p>
+    <w:p>
+      <w:r>
+        <w:t xml:space="preserve">The net </w:t>
+      </w:r>
+      <w:proofErr w:type="spellStart"/>
+      <w:r>
+        <w:t>net</w:t>
+      </w:r>
+      <w:proofErr w:type="spellEnd"/>
+      <w:r>
+        <w:t xml:space="preserve"> on purpose &amp; structure and substance these points is that the essay needs to signal when and how it is deviating from the readings it draws on – without doing so it inadvertently reflects a misunderstanding of the material. </w:t>
       </w:r>
     </w:p>
     <w:p>
       <w:r>
         <w:lastRenderedPageBreak/>
-        <w:t>This might mean either acknowledging his skepticism, or being explicit somewhere that for ex, while Hamilton warns soft news will displace policy info, you’re arguing that he actually under-estimates the political learning that happens through entertainment. Other parts of chapter 1 could be drawn on to make a different clearer argument.  As an example, this might look like: “</w:t>
+        <w:t xml:space="preserve">This might mean either acknowledging his skepticism, or being explicit somewhere that for ex, while Hamilton warns soft news will displace policy info, you’re arguing that he </w:t>
+      </w:r>
+      <w:proofErr w:type="gramStart"/>
+      <w:r>
+        <w:t>actually under-estimates</w:t>
+      </w:r>
+      <w:proofErr w:type="gramEnd"/>
+      <w:r>
+        <w:t xml:space="preserve"> the political learning that happens through entertainment. Other parts of chapter 1 could be drawn on to make a different clearer argument.  As an example, this might look like: “</w:t>
       </w:r>
       <w:r>
         <w:t>Hamilton acknowledges that media markets underproduce hard news, but he also identifies policy tools and professional norms that can counteract these tendencies. To the extent these interventions succeed, media can provide partial mitigation of rational ignorance even if imperfect."</w:t>
@@ -520,7 +690,15 @@
         <w:t xml:space="preserve">why the media landscape has developed the way it has (demand side – there’s a feedback cycle we could draw between Hamilton </w:t>
       </w:r>
       <w:r>
-        <w:t xml:space="preserve">and Darr, and a “soft news” or clickbait media landscape, and the essays’ points about substantive policy coverage), (2) what we know or don’t know about consequences of the media landscape on political knowledge and mobilization (bit of Grinspan), and potentially either (3) public opinion unit info that might actually suggest people are drawn to info that confirms their predispositions or (4) matters of polarization. </w:t>
+        <w:t xml:space="preserve">and Darr, and a “soft news” or clickbait media landscape, and the essays’ points about substantive policy coverage), (2) what we know or don’t know about consequences of the media landscape on political knowledge and mobilization (bit of </w:t>
+      </w:r>
+      <w:proofErr w:type="spellStart"/>
+      <w:r>
+        <w:t>Grinspan</w:t>
+      </w:r>
+      <w:proofErr w:type="spellEnd"/>
+      <w:r>
+        <w:t xml:space="preserve">), and potentially either (3) public opinion unit info that might actually suggest people are drawn to info that confirms their predispositions or (4) matters of polarization. </w:t>
       </w:r>
     </w:p>
     <w:p>
@@ -743,7 +921,15 @@
               <w:spacing w:after="160" w:line="278" w:lineRule="auto"/>
             </w:pPr>
             <w:r>
-              <w:t>Argument is generally sound, but could use additional support and/or tightening.</w:t>
+              <w:t xml:space="preserve">Argument is generally </w:t>
+            </w:r>
+            <w:proofErr w:type="gramStart"/>
+            <w:r>
+              <w:t>sound, but</w:t>
+            </w:r>
+            <w:proofErr w:type="gramEnd"/>
+            <w:r>
+              <w:t xml:space="preserve"> could use additional support and/or tightening.</w:t>
             </w:r>
           </w:p>
         </w:tc>
@@ -756,7 +942,15 @@
               <w:spacing w:after="160" w:line="278" w:lineRule="auto"/>
             </w:pPr>
             <w:r>
-              <w:t>Argument is okay but includes some combination of poorly-defended or irrelevant points</w:t>
+              <w:t xml:space="preserve">Argument is okay but includes some combination of </w:t>
+            </w:r>
+            <w:proofErr w:type="gramStart"/>
+            <w:r>
+              <w:t>poorly-defended</w:t>
+            </w:r>
+            <w:proofErr w:type="gramEnd"/>
+            <w:r>
+              <w:t xml:space="preserve"> or irrelevant points</w:t>
             </w:r>
           </w:p>
         </w:tc>
@@ -1037,12 +1231,21 @@
           <w:bCs/>
         </w:rPr>
       </w:pPr>
+      <w:proofErr w:type="spellStart"/>
       <w:r>
         <w:rPr>
           <w:b/>
           <w:bCs/>
         </w:rPr>
-        <w:t>Skena – A (high end)</w:t>
+        <w:t>Skena</w:t>
+      </w:r>
+      <w:proofErr w:type="spellEnd"/>
+      <w:r>
+        <w:rPr>
+          <w:b/>
+          <w:bCs/>
+        </w:rPr>
+        <w:t xml:space="preserve"> – A (high end)</w:t>
       </w:r>
     </w:p>
     <w:p>
@@ -1050,13 +1253,15 @@
         <w:t>S&amp;P</w:t>
       </w:r>
       <w:r>
-        <w:t xml:space="preserve"> –  Excellent, c</w:t>
-      </w:r>
-      <w:r>
-        <w:t xml:space="preserve">ouple </w:t>
-      </w:r>
-      <w:r>
-        <w:t xml:space="preserve">points off maybe for noted </w:t>
+        <w:t xml:space="preserve"> </w:t>
+      </w:r>
+      <w:proofErr w:type="gramStart"/>
+      <w:r>
+        <w:t>–  Excellent</w:t>
+      </w:r>
+      <w:proofErr w:type="gramEnd"/>
+      <w:r>
+        <w:t xml:space="preserve">, couple points off maybe for noted </w:t>
       </w:r>
       <w:r>
         <w:t>below</w:t>
@@ -1936,6 +2141,7 @@
   <w:style w:type="character" w:default="1" w:styleId="DefaultParagraphFont">
     <w:name w:val="Default Paragraph Font"/>
     <w:uiPriority w:val="1"/>
+    <w:semiHidden/>
     <w:unhideWhenUsed/>
   </w:style>
   <w:style w:type="table" w:default="1" w:styleId="TableNormal">

</xml_diff>